<commit_message>
Atualiza os três documentos com a revisão final do modelo
- Documento de visão: glossário ampliado, nova regra RN-080 e diagrama de contexto atualizado
- Casos de uso: áreas de atuação e serviço externo de autenticação
- Modelagem de domínio: Cobrança Avulsa também ligada a Atendimento sem agendamento
</commit_message>
<xml_diff>
--- a/docs/01-visao-requisitos-e-regras.docx
+++ b/docs/01-visao-requisitos-e-regras.docx
@@ -9321,19 +9321,15 @@
         <w:rPr>
           <w:b w:val="1"/>
           <w:bCs w:val="1"/>
-          <w:sz w:val="24"/>
-          <w:szCs w:val="24"/>
-          <w:rtl w:val="0"/>
-        </w:rPr>
-        <w:t xml:space="preserve">Atendente:</w:t>
-      </w:r>
-      <w:r>
-        <w:rPr>
-          <w:sz w:val="24"/>
-          <w:szCs w:val="24"/>
-          <w:rtl w:val="0"/>
-        </w:rPr>
-        <w:t xml:space="preserve"> Usuário com perfil de acesso responsável por atividades administrativas relacionadas aos pacientes, profissionais, agenda e agendamentos, respeitando as restrições de acesso às informações clínicas.</w:t>
+          <w:rtl w:val="0"/>
+        </w:rPr>
+        <w:t xml:space="preserve">Área de Atuação:</w:t>
+      </w:r>
+      <w:r>
+        <w:rPr>
+          <w:rtl w:val="0"/>
+        </w:rPr>
+        <w:t xml:space="preserve"> Área da Psicologia em que o Psicólogo atua, como clínica, organizacional ou escolar, escolhida de uma lista predefinida da plataforma. O Psicólogo não pode criar novas áreas.</w:t>
       </w:r>
       <w:r>
         <w:rPr>
@@ -9363,15 +9359,15 @@
           <w:szCs w:val="24"/>
           <w:rtl w:val="0"/>
         </w:rPr>
-        <w:t xml:space="preserve">Atendimento:</w:t>
-      </w:r>
-      <w:r>
-        <w:rPr>
-          <w:sz w:val="24"/>
-          <w:szCs w:val="24"/>
-          <w:rtl w:val="0"/>
-        </w:rPr>
-        <w:t xml:space="preserve"> Registro referente à realização de uma consulta entre Psicólogo e Paciente, associado ao respectivo agendamento quando aplicável.</w:t>
+        <w:t xml:space="preserve">Atendente:</w:t>
+      </w:r>
+      <w:r>
+        <w:rPr>
+          <w:sz w:val="24"/>
+          <w:szCs w:val="24"/>
+          <w:rtl w:val="0"/>
+        </w:rPr>
+        <w:t xml:space="preserve"> Usuário com perfil de acesso responsável por atividades administrativas relacionadas aos pacientes, profissionais, agenda e agendamentos, respeitando as restrições de acesso às informações clínicas.</w:t>
       </w:r>
       <w:r>
         <w:rPr>
@@ -9401,15 +9397,15 @@
           <w:szCs w:val="24"/>
           <w:rtl w:val="0"/>
         </w:rPr>
-        <w:t xml:space="preserve">Auditoria:</w:t>
-      </w:r>
-      <w:r>
-        <w:rPr>
-          <w:sz w:val="24"/>
-          <w:szCs w:val="24"/>
-          <w:rtl w:val="0"/>
-        </w:rPr>
-        <w:t xml:space="preserve"> Registro de operações relevantes realizadas na plataforma para fins de rastreabilidade e acompanhamento.</w:t>
+        <w:t xml:space="preserve">Atendimento:</w:t>
+      </w:r>
+      <w:r>
+        <w:rPr>
+          <w:sz w:val="24"/>
+          <w:szCs w:val="24"/>
+          <w:rtl w:val="0"/>
+        </w:rPr>
+        <w:t xml:space="preserve"> Registro referente à realização de uma consulta entre Psicólogo e Paciente, associado ao respectivo agendamento quando aplicável.</w:t>
       </w:r>
       <w:r>
         <w:rPr>
@@ -9439,15 +9435,15 @@
           <w:szCs w:val="24"/>
           <w:rtl w:val="0"/>
         </w:rPr>
-        <w:t xml:space="preserve">Compartilhamento controlado:</w:t>
-      </w:r>
-      <w:r>
-        <w:rPr>
-          <w:sz w:val="24"/>
-          <w:szCs w:val="24"/>
-          <w:rtl w:val="0"/>
-        </w:rPr>
-        <w:t xml:space="preserve"> Disponibilização de informação ou documento especificamente autorizado para determinado destinatário e finalidade, respeitando as permissões e restrições aplicáveis.</w:t>
+        <w:t xml:space="preserve">Auditoria:</w:t>
+      </w:r>
+      <w:r>
+        <w:rPr>
+          <w:sz w:val="24"/>
+          <w:szCs w:val="24"/>
+          <w:rtl w:val="0"/>
+        </w:rPr>
+        <w:t xml:space="preserve"> Registro de operações relevantes realizadas na plataforma para fins de rastreabilidade e acompanhamento.</w:t>
       </w:r>
       <w:r>
         <w:rPr>
@@ -9473,24 +9469,71 @@
         <w:rPr>
           <w:b w:val="1"/>
           <w:bCs w:val="1"/>
-          <w:sz w:val="24"/>
-          <w:szCs w:val="24"/>
-          <w:rtl w:val="0"/>
-        </w:rPr>
-        <w:t xml:space="preserve">Disponibilidade:</w:t>
-      </w:r>
-      <w:r>
-        <w:rPr>
-          <w:sz w:val="24"/>
-          <w:szCs w:val="24"/>
-          <w:rtl w:val="0"/>
-        </w:rPr>
-        <w:t xml:space="preserve"> Períodos definidos pelo Psicólogo nos quais poderão ser realizados atendimentos, considerando padrões recorrentes, exceções e bloqueios.</w:t>
-      </w:r>
-      <w:r>
-        <w:rPr>
-          <w:rtl w:val="0"/>
-        </w:rPr>
+          <w:rtl w:val="0"/>
+        </w:rPr>
+        <w:t xml:space="preserve">Bloqueio de Agenda:</w:t>
+      </w:r>
+      <w:r>
+        <w:rPr>
+          <w:rtl w:val="0"/>
+        </w:rPr>
+        <w:t xml:space="preserve"> Restrição registrada em um período da agenda do Psicólogo que impede a oferta de horários nesse intervalo.</w:t>
+      </w:r>
+    </w:p>
+    <w:p>
+      <w:pPr>
+        <w:widowControl w:val="0"/>
+        <w:numPr>
+          <w:ilvl w:val="0"/>
+          <w:numId w:val="51"/>
+        </w:numPr>
+        <w:spacing w:after="0" w:before="0" w:line="360" w:lineRule="auto"/>
+        <w:ind w:left="720" w:hanging="360"/>
+        <w:rPr>
+          <w:u w:val="none"/>
+        </w:rPr>
+      </w:pPr>
+      <w:r>
+        <w:rPr>
+          <w:b w:val="1"/>
+          <w:bCs w:val="1"/>
+          <w:rtl w:val="0"/>
+        </w:rPr>
+        <w:t xml:space="preserve">Cobrança:</w:t>
+      </w:r>
+      <w:r>
+        <w:rPr>
+          <w:rtl w:val="0"/>
+        </w:rPr>
+        <w:t xml:space="preserve"> Valor devido pelos serviços prestados, gerado por consulta avulsa ou por mensalidade de recorrência e quitado por meio de Pagamento.</w:t>
+      </w:r>
+    </w:p>
+    <w:p>
+      <w:pPr>
+        <w:widowControl w:val="0"/>
+        <w:numPr>
+          <w:ilvl w:val="0"/>
+          <w:numId w:val="51"/>
+        </w:numPr>
+        <w:spacing w:after="0" w:before="0" w:line="360" w:lineRule="auto"/>
+        <w:ind w:left="720" w:hanging="360"/>
+        <w:rPr>
+          <w:u w:val="none"/>
+        </w:rPr>
+      </w:pPr>
+      <w:r>
+        <w:rPr>
+          <w:b w:val="1"/>
+          <w:bCs w:val="1"/>
+          <w:rtl w:val="0"/>
+        </w:rPr>
+        <w:t xml:space="preserve">Cobrança Avulsa:</w:t>
+      </w:r>
+      <w:r>
+        <w:rPr>
+          <w:rtl w:val="0"/>
+        </w:rPr>
+        <w:t xml:space="preserve"> Cobrança referente a uma consulta específica, vinculada a um Agendamento ou a um Atendimento realizado sem agendamento prévio.</w:t>
       </w:r>
     </w:p>
     <w:p>
@@ -9515,15 +9558,15 @@
           <w:szCs w:val="24"/>
           <w:rtl w:val="0"/>
         </w:rPr>
-        <w:t xml:space="preserve">Documento compartilhável:</w:t>
-      </w:r>
-      <w:r>
-        <w:rPr>
-          <w:sz w:val="24"/>
-          <w:szCs w:val="24"/>
-          <w:rtl w:val="0"/>
-        </w:rPr>
-        <w:t xml:space="preserve"> Documento ou informação preparado especificamente para disponibilização autorizada a determinado destinatário, distinto dos registros internos de Evolução.</w:t>
+        <w:t xml:space="preserve">Compartilhamento controlado:</w:t>
+      </w:r>
+      <w:r>
+        <w:rPr>
+          <w:sz w:val="24"/>
+          <w:szCs w:val="24"/>
+          <w:rtl w:val="0"/>
+        </w:rPr>
+        <w:t xml:space="preserve"> Disponibilização de informação ou documento especificamente autorizado para determinado destinatário e finalidade, respeitando as permissões e restrições aplicáveis.</w:t>
       </w:r>
       <w:r>
         <w:rPr>
@@ -9549,19 +9592,15 @@
         <w:rPr>
           <w:b w:val="1"/>
           <w:bCs w:val="1"/>
-          <w:sz w:val="24"/>
-          <w:szCs w:val="24"/>
-          <w:rtl w:val="0"/>
-        </w:rPr>
-        <w:t xml:space="preserve">Encaixe:</w:t>
-      </w:r>
-      <w:r>
-        <w:rPr>
-          <w:sz w:val="24"/>
-          <w:szCs w:val="24"/>
-          <w:rtl w:val="0"/>
-        </w:rPr>
-        <w:t xml:space="preserve"> Utilização de um horário que se tornou disponível para possibilitar o atendimento de um Paciente interessado, conforme as regras aplicáveis.</w:t>
+          <w:rtl w:val="0"/>
+        </w:rPr>
+        <w:t xml:space="preserve">Destinatário autorizado:</w:t>
+      </w:r>
+      <w:r>
+        <w:rPr>
+          <w:rtl w:val="0"/>
+        </w:rPr>
+        <w:t xml:space="preserve"> Pessoa ou profissional externo que recebe acesso protegido a um documento compartilhado pelo Psicólogo, conforme as condições definidas no compartilhamento.</w:t>
       </w:r>
       <w:r>
         <w:rPr>
@@ -9591,15 +9630,15 @@
           <w:szCs w:val="24"/>
           <w:rtl w:val="0"/>
         </w:rPr>
-        <w:t xml:space="preserve">Evolução:</w:t>
-      </w:r>
-      <w:r>
-        <w:rPr>
-          <w:sz w:val="24"/>
-          <w:szCs w:val="24"/>
-          <w:rtl w:val="0"/>
-        </w:rPr>
-        <w:t xml:space="preserve"> Registro profissional e restrito produzido pelo Psicólogo para acompanhamento do Paciente ao longo dos atendimentos, mantendo histórico das alterações realizadas.</w:t>
+        <w:t xml:space="preserve">Disponibilidade:</w:t>
+      </w:r>
+      <w:r>
+        <w:rPr>
+          <w:sz w:val="24"/>
+          <w:szCs w:val="24"/>
+          <w:rtl w:val="0"/>
+        </w:rPr>
+        <w:t xml:space="preserve"> Períodos definidos pelo Psicólogo nos quais poderão ser realizados atendimentos, considerando padrões recorrentes, exceções e bloqueios.</w:t>
       </w:r>
       <w:r>
         <w:rPr>
@@ -9629,15 +9668,15 @@
           <w:szCs w:val="24"/>
           <w:rtl w:val="0"/>
         </w:rPr>
-        <w:t xml:space="preserve">Lista de espera:</w:t>
-      </w:r>
-      <w:r>
-        <w:rPr>
-          <w:sz w:val="24"/>
-          <w:szCs w:val="24"/>
-          <w:rtl w:val="0"/>
-        </w:rPr>
-        <w:t xml:space="preserve"> Registro de pacientes interessados em horários que possam se tornar disponíveis para atendimento.</w:t>
+        <w:t xml:space="preserve">Documento compartilhável:</w:t>
+      </w:r>
+      <w:r>
+        <w:rPr>
+          <w:sz w:val="24"/>
+          <w:szCs w:val="24"/>
+          <w:rtl w:val="0"/>
+        </w:rPr>
+        <w:t xml:space="preserve"> Documento ou informação preparado especificamente para disponibilização autorizada a determinado destinatário, distinto dos registros internos de Evolução.</w:t>
       </w:r>
       <w:r>
         <w:rPr>
@@ -9667,15 +9706,15 @@
           <w:szCs w:val="24"/>
           <w:rtl w:val="0"/>
         </w:rPr>
-        <w:t xml:space="preserve">Paciente:</w:t>
-      </w:r>
-      <w:r>
-        <w:rPr>
-          <w:sz w:val="24"/>
-          <w:szCs w:val="24"/>
-          <w:rtl w:val="0"/>
-        </w:rPr>
-        <w:t xml:space="preserve"> Pessoa que recebe os serviços psicológicos gerenciados pela plataforma, podendo possuir ou não conta própria de acesso ao sistema.</w:t>
+        <w:t xml:space="preserve">Encaixe:</w:t>
+      </w:r>
+      <w:r>
+        <w:rPr>
+          <w:sz w:val="24"/>
+          <w:szCs w:val="24"/>
+          <w:rtl w:val="0"/>
+        </w:rPr>
+        <w:t xml:space="preserve"> Utilização de um horário que se tornou disponível para possibilitar o atendimento de um Paciente interessado, conforme as regras aplicáveis.</w:t>
       </w:r>
       <w:r>
         <w:rPr>
@@ -9705,15 +9744,15 @@
           <w:szCs w:val="24"/>
           <w:rtl w:val="0"/>
         </w:rPr>
-        <w:t xml:space="preserve">Pagamento:</w:t>
-      </w:r>
-      <w:r>
-        <w:rPr>
-          <w:sz w:val="24"/>
-          <w:szCs w:val="24"/>
-          <w:rtl w:val="0"/>
-        </w:rPr>
-        <w:t xml:space="preserve"> Registro relacionado a uma operação financeira associada aos serviços disponibilizados ao Paciente pela plataforma.</w:t>
+        <w:t xml:space="preserve">Evolução:</w:t>
+      </w:r>
+      <w:r>
+        <w:rPr>
+          <w:sz w:val="24"/>
+          <w:szCs w:val="24"/>
+          <w:rtl w:val="0"/>
+        </w:rPr>
+        <w:t xml:space="preserve"> Registro profissional e restrito produzido pelo Psicólogo para acompanhamento do Paciente ao longo dos atendimentos, mantendo histórico das alterações realizadas.</w:t>
       </w:r>
       <w:r>
         <w:rPr>
@@ -9739,19 +9778,15 @@
         <w:rPr>
           <w:b w:val="1"/>
           <w:bCs w:val="1"/>
-          <w:sz w:val="24"/>
-          <w:szCs w:val="24"/>
-          <w:rtl w:val="0"/>
-        </w:rPr>
-        <w:t xml:space="preserve">Perfil de acesso:</w:t>
-      </w:r>
-      <w:r>
-        <w:rPr>
-          <w:sz w:val="24"/>
-          <w:szCs w:val="24"/>
-          <w:rtl w:val="0"/>
-        </w:rPr>
-        <w:t xml:space="preserve"> Conjunto predefinido de permissões e responsabilidades associado a uma conta de Usuário. A plataforma prevê os perfis Administrador, Atendente, Psicólogo e Paciente.</w:t>
+          <w:rtl w:val="0"/>
+        </w:rPr>
+        <w:t xml:space="preserve">Inscrição na Lista de Espera:</w:t>
+      </w:r>
+      <w:r>
+        <w:rPr>
+          <w:rtl w:val="0"/>
+        </w:rPr>
+        <w:t xml:space="preserve"> Participação de um Paciente na lista de espera de um Psicólogo, com suas preferências de horário e sua situação.</w:t>
       </w:r>
       <w:r>
         <w:rPr>
@@ -9781,15 +9816,15 @@
           <w:szCs w:val="24"/>
           <w:rtl w:val="0"/>
         </w:rPr>
-        <w:t xml:space="preserve">Permissão:</w:t>
-      </w:r>
-      <w:r>
-        <w:rPr>
-          <w:sz w:val="24"/>
-          <w:szCs w:val="24"/>
-          <w:rtl w:val="0"/>
-        </w:rPr>
-        <w:t xml:space="preserve"> Autorização para acessar ou executar determinada funcionalidade ou informação da plataforma, podendo decorrer do perfil de acesso e, quando aplicável, dos vínculos existentes.</w:t>
+        <w:t xml:space="preserve">Lista de espera:</w:t>
+      </w:r>
+      <w:r>
+        <w:rPr>
+          <w:sz w:val="24"/>
+          <w:szCs w:val="24"/>
+          <w:rtl w:val="0"/>
+        </w:rPr>
+        <w:t xml:space="preserve"> Registro de pacientes interessados em horários que possam se tornar disponíveis para atendimento.</w:t>
       </w:r>
       <w:r>
         <w:rPr>
@@ -9815,24 +9850,43 @@
         <w:rPr>
           <w:b w:val="1"/>
           <w:bCs w:val="1"/>
-          <w:sz w:val="24"/>
-          <w:szCs w:val="24"/>
-          <w:rtl w:val="0"/>
-        </w:rPr>
-        <w:t xml:space="preserve">Psicólogo:</w:t>
-      </w:r>
-      <w:r>
-        <w:rPr>
-          <w:sz w:val="24"/>
-          <w:szCs w:val="24"/>
-          <w:rtl w:val="0"/>
-        </w:rPr>
-        <w:t xml:space="preserve"> Profissional que utiliza a plataforma para gerenciar seu perfil profissional, disponibilidade, agenda, atendimentos e acompanhamento dos pacientes com os quais possua relação de atendimento.</w:t>
-      </w:r>
-      <w:r>
-        <w:rPr>
-          <w:rtl w:val="0"/>
-        </w:rPr>
+          <w:rtl w:val="0"/>
+        </w:rPr>
+        <w:t xml:space="preserve">Mensalidade:</w:t>
+      </w:r>
+      <w:r>
+        <w:rPr>
+          <w:rtl w:val="0"/>
+        </w:rPr>
+        <w:t xml:space="preserve"> Cobrança de valor fixo vinculada a uma recorrência de atendimento.</w:t>
+      </w:r>
+    </w:p>
+    <w:p>
+      <w:pPr>
+        <w:widowControl w:val="0"/>
+        <w:numPr>
+          <w:ilvl w:val="0"/>
+          <w:numId w:val="51"/>
+        </w:numPr>
+        <w:spacing w:after="0" w:before="0" w:line="360" w:lineRule="auto"/>
+        <w:ind w:left="720" w:hanging="360"/>
+        <w:rPr>
+          <w:u w:val="none"/>
+        </w:rPr>
+      </w:pPr>
+      <w:r>
+        <w:rPr>
+          <w:b w:val="1"/>
+          <w:bCs w:val="1"/>
+          <w:rtl w:val="0"/>
+        </w:rPr>
+        <w:t xml:space="preserve">Oferta de Encaixe:</w:t>
+      </w:r>
+      <w:r>
+        <w:rPr>
+          <w:rtl w:val="0"/>
+        </w:rPr>
+        <w:t xml:space="preserve"> Horário que se tornou disponível e é oferecido a um Paciente inscrito na lista de espera, que pode aceitá-lo ou recusá-lo.</w:t>
       </w:r>
     </w:p>
     <w:p>
@@ -9857,15 +9911,15 @@
           <w:szCs w:val="24"/>
           <w:rtl w:val="0"/>
         </w:rPr>
-        <w:t xml:space="preserve">Recorrência de atendimento:</w:t>
-      </w:r>
-      <w:r>
-        <w:rPr>
-          <w:sz w:val="24"/>
-          <w:szCs w:val="24"/>
-          <w:rtl w:val="0"/>
-        </w:rPr>
-        <w:t xml:space="preserve"> Regra que estabelece a reserva periódica de um horário para continuidade dos atendimentos entre Paciente e Psicólogo. A recorrência não representa a criação antecipada de todos os agendamentos futuros.</w:t>
+        <w:t xml:space="preserve">Paciente:</w:t>
+      </w:r>
+      <w:r>
+        <w:rPr>
+          <w:sz w:val="24"/>
+          <w:szCs w:val="24"/>
+          <w:rtl w:val="0"/>
+        </w:rPr>
+        <w:t xml:space="preserve"> Pessoa que recebe os serviços psicológicos gerenciados pela plataforma, podendo possuir ou não conta própria de acesso ao sistema.</w:t>
       </w:r>
       <w:r>
         <w:rPr>
@@ -9891,19 +9945,15 @@
         <w:rPr>
           <w:b w:val="1"/>
           <w:bCs w:val="1"/>
-          <w:sz w:val="24"/>
-          <w:szCs w:val="24"/>
-          <w:rtl w:val="0"/>
-        </w:rPr>
-        <w:t xml:space="preserve">Responsável:</w:t>
-      </w:r>
-      <w:r>
-        <w:rPr>
-          <w:sz w:val="24"/>
-          <w:szCs w:val="24"/>
-          <w:rtl w:val="0"/>
-        </w:rPr>
-        <w:t xml:space="preserve"> Papel exercido por um Usuário que possua vínculo de responsabilidade com determinado Paciente, permitindo realizar operações e acessar informações autorizadas relacionadas a esse Paciente.</w:t>
+          <w:rtl w:val="0"/>
+        </w:rPr>
+        <w:t xml:space="preserve">Pagador externo:</w:t>
+      </w:r>
+      <w:r>
+        <w:rPr>
+          <w:rtl w:val="0"/>
+        </w:rPr>
+        <w:t xml:space="preserve"> Terceiro sem conta na plataforma que paga uma Cobrança por meio de link protegido, sem acesso a dados pessoais ou clínicos.</w:t>
       </w:r>
       <w:r>
         <w:rPr>
@@ -9933,15 +9983,15 @@
           <w:szCs w:val="24"/>
           <w:rtl w:val="0"/>
         </w:rPr>
-        <w:t xml:space="preserve">Serviço externo:</w:t>
-      </w:r>
-      <w:r>
-        <w:rPr>
-          <w:sz w:val="24"/>
-          <w:szCs w:val="24"/>
-          <w:rtl w:val="0"/>
-        </w:rPr>
-        <w:t xml:space="preserve"> Sistema ou serviço de terceiros que interage com a plataforma para executar uma função complementar, como autenticação, processamento de pagamentos ou envio de notificações.</w:t>
+        <w:t xml:space="preserve">Pagamento:</w:t>
+      </w:r>
+      <w:r>
+        <w:rPr>
+          <w:sz w:val="24"/>
+          <w:szCs w:val="24"/>
+          <w:rtl w:val="0"/>
+        </w:rPr>
+        <w:t xml:space="preserve"> Registro relacionado a uma operação financeira associada aos serviços disponibilizados ao Paciente pela plataforma.</w:t>
       </w:r>
       <w:r>
         <w:rPr>
@@ -9971,6 +10021,268 @@
           <w:szCs w:val="24"/>
           <w:rtl w:val="0"/>
         </w:rPr>
+        <w:t xml:space="preserve">Perfil de acesso:</w:t>
+      </w:r>
+      <w:r>
+        <w:rPr>
+          <w:sz w:val="24"/>
+          <w:szCs w:val="24"/>
+          <w:rtl w:val="0"/>
+        </w:rPr>
+        <w:t xml:space="preserve"> Conjunto predefinido de permissões e responsabilidades associado a uma conta de Usuário. A plataforma prevê os perfis Administrador, Atendente, Psicólogo e Paciente.</w:t>
+      </w:r>
+      <w:r>
+        <w:rPr>
+          <w:rtl w:val="0"/>
+        </w:rPr>
+      </w:r>
+    </w:p>
+    <w:p>
+      <w:pPr>
+        <w:widowControl w:val="0"/>
+        <w:numPr>
+          <w:ilvl w:val="0"/>
+          <w:numId w:val="51"/>
+        </w:numPr>
+        <w:spacing w:after="0" w:before="0" w:line="360" w:lineRule="auto"/>
+        <w:ind w:left="720" w:hanging="360"/>
+        <w:rPr>
+          <w:sz w:val="26"/>
+          <w:szCs w:val="26"/>
+        </w:rPr>
+      </w:pPr>
+      <w:r>
+        <w:rPr>
+          <w:b w:val="1"/>
+          <w:bCs w:val="1"/>
+          <w:sz w:val="24"/>
+          <w:szCs w:val="24"/>
+          <w:rtl w:val="0"/>
+        </w:rPr>
+        <w:t xml:space="preserve">Permissão:</w:t>
+      </w:r>
+      <w:r>
+        <w:rPr>
+          <w:sz w:val="24"/>
+          <w:szCs w:val="24"/>
+          <w:rtl w:val="0"/>
+        </w:rPr>
+        <w:t xml:space="preserve"> Autorização para acessar ou executar determinada funcionalidade ou informação da plataforma, podendo decorrer do perfil de acesso e, quando aplicável, dos vínculos existentes.</w:t>
+      </w:r>
+      <w:r>
+        <w:rPr>
+          <w:rtl w:val="0"/>
+        </w:rPr>
+      </w:r>
+    </w:p>
+    <w:p>
+      <w:pPr>
+        <w:widowControl w:val="0"/>
+        <w:numPr>
+          <w:ilvl w:val="0"/>
+          <w:numId w:val="51"/>
+        </w:numPr>
+        <w:spacing w:after="0" w:before="0" w:line="360" w:lineRule="auto"/>
+        <w:ind w:left="720" w:hanging="360"/>
+        <w:rPr>
+          <w:sz w:val="26"/>
+          <w:szCs w:val="26"/>
+        </w:rPr>
+      </w:pPr>
+      <w:r>
+        <w:rPr>
+          <w:b w:val="1"/>
+          <w:bCs w:val="1"/>
+          <w:sz w:val="24"/>
+          <w:szCs w:val="24"/>
+          <w:rtl w:val="0"/>
+        </w:rPr>
+        <w:t xml:space="preserve">Psicólogo:</w:t>
+      </w:r>
+      <w:r>
+        <w:rPr>
+          <w:sz w:val="24"/>
+          <w:szCs w:val="24"/>
+          <w:rtl w:val="0"/>
+        </w:rPr>
+        <w:t xml:space="preserve"> Profissional que utiliza a plataforma para gerenciar seu perfil profissional, disponibilidade, agenda, atendimentos e acompanhamento dos pacientes com os quais possua relação de atendimento.</w:t>
+      </w:r>
+      <w:r>
+        <w:rPr>
+          <w:rtl w:val="0"/>
+        </w:rPr>
+      </w:r>
+    </w:p>
+    <w:p>
+      <w:pPr>
+        <w:widowControl w:val="0"/>
+        <w:numPr>
+          <w:ilvl w:val="0"/>
+          <w:numId w:val="51"/>
+        </w:numPr>
+        <w:spacing w:after="0" w:before="0" w:line="360" w:lineRule="auto"/>
+        <w:ind w:left="720" w:hanging="360"/>
+        <w:rPr>
+          <w:sz w:val="26"/>
+          <w:szCs w:val="26"/>
+        </w:rPr>
+      </w:pPr>
+      <w:r>
+        <w:rPr>
+          <w:b w:val="1"/>
+          <w:bCs w:val="1"/>
+          <w:sz w:val="24"/>
+          <w:szCs w:val="24"/>
+          <w:rtl w:val="0"/>
+        </w:rPr>
+        <w:t xml:space="preserve">Recorrência de atendimento:</w:t>
+      </w:r>
+      <w:r>
+        <w:rPr>
+          <w:sz w:val="24"/>
+          <w:szCs w:val="24"/>
+          <w:rtl w:val="0"/>
+        </w:rPr>
+        <w:t xml:space="preserve"> Regra que estabelece a reserva periódica de um horário para continuidade dos atendimentos entre Paciente e Psicólogo. A recorrência não representa a criação antecipada de todos os agendamentos futuros.</w:t>
+      </w:r>
+      <w:r>
+        <w:rPr>
+          <w:rtl w:val="0"/>
+        </w:rPr>
+      </w:r>
+    </w:p>
+    <w:p>
+      <w:pPr>
+        <w:widowControl w:val="0"/>
+        <w:numPr>
+          <w:ilvl w:val="0"/>
+          <w:numId w:val="51"/>
+        </w:numPr>
+        <w:spacing w:after="0" w:before="0" w:line="360" w:lineRule="auto"/>
+        <w:ind w:left="720" w:hanging="360"/>
+        <w:rPr>
+          <w:sz w:val="26"/>
+          <w:szCs w:val="26"/>
+        </w:rPr>
+      </w:pPr>
+      <w:r>
+        <w:rPr>
+          <w:b w:val="1"/>
+          <w:bCs w:val="1"/>
+          <w:sz w:val="24"/>
+          <w:szCs w:val="24"/>
+          <w:rtl w:val="0"/>
+        </w:rPr>
+        <w:t xml:space="preserve">Responsável:</w:t>
+      </w:r>
+      <w:r>
+        <w:rPr>
+          <w:sz w:val="24"/>
+          <w:szCs w:val="24"/>
+          <w:rtl w:val="0"/>
+        </w:rPr>
+        <w:t xml:space="preserve"> Papel exercido por um Usuário que possua vínculo de responsabilidade com determinado Paciente, permitindo realizar operações e acessar informações autorizadas relacionadas a esse Paciente.</w:t>
+      </w:r>
+      <w:r>
+        <w:rPr>
+          <w:rtl w:val="0"/>
+        </w:rPr>
+      </w:r>
+    </w:p>
+    <w:p>
+      <w:pPr>
+        <w:widowControl w:val="0"/>
+        <w:numPr>
+          <w:ilvl w:val="0"/>
+          <w:numId w:val="51"/>
+        </w:numPr>
+        <w:spacing w:after="0" w:before="0" w:line="360" w:lineRule="auto"/>
+        <w:ind w:left="720" w:hanging="360"/>
+        <w:rPr>
+          <w:sz w:val="26"/>
+          <w:szCs w:val="26"/>
+        </w:rPr>
+      </w:pPr>
+      <w:r>
+        <w:rPr>
+          <w:b w:val="1"/>
+          <w:bCs w:val="1"/>
+          <w:sz w:val="24"/>
+          <w:szCs w:val="24"/>
+          <w:rtl w:val="0"/>
+        </w:rPr>
+        <w:t xml:space="preserve">Serviço externo:</w:t>
+      </w:r>
+      <w:r>
+        <w:rPr>
+          <w:sz w:val="24"/>
+          <w:szCs w:val="24"/>
+          <w:rtl w:val="0"/>
+        </w:rPr>
+        <w:t xml:space="preserve"> Sistema ou serviço de terceiros que interage com a plataforma para executar uma função complementar, como autenticação, processamento de pagamentos ou envio de notificações.</w:t>
+      </w:r>
+      <w:r>
+        <w:rPr>
+          <w:rtl w:val="0"/>
+        </w:rPr>
+      </w:r>
+    </w:p>
+    <w:p>
+      <w:pPr>
+        <w:widowControl w:val="0"/>
+        <w:numPr>
+          <w:ilvl w:val="0"/>
+          <w:numId w:val="51"/>
+        </w:numPr>
+        <w:spacing w:after="0" w:before="0" w:line="360" w:lineRule="auto"/>
+        <w:ind w:left="720" w:hanging="360"/>
+        <w:rPr>
+          <w:sz w:val="26"/>
+          <w:szCs w:val="26"/>
+        </w:rPr>
+      </w:pPr>
+      <w:r>
+        <w:rPr>
+          <w:b w:val="1"/>
+          <w:bCs w:val="1"/>
+          <w:rtl w:val="0"/>
+        </w:rPr>
+        <w:t xml:space="preserve">Tentativa de Pagamento:</w:t>
+      </w:r>
+      <w:r>
+        <w:rPr>
+          <w:rtl w:val="0"/>
+        </w:rPr>
+        <w:t xml:space="preserve"> Operação iniciada para quitar uma Cobrança, que pode ser confirmada ou não. Só uma tentativa confirmada gera o Pagamento.</w:t>
+      </w:r>
+      <w:r>
+        <w:rPr>
+          <w:rtl w:val="0"/>
+        </w:rPr>
+      </w:r>
+    </w:p>
+    <w:p>
+      <w:pPr>
+        <w:widowControl w:val="0"/>
+        <w:numPr>
+          <w:ilvl w:val="0"/>
+          <w:numId w:val="51"/>
+        </w:numPr>
+        <w:spacing w:after="0" w:before="0" w:line="360" w:lineRule="auto"/>
+        <w:ind w:left="720" w:hanging="360"/>
+        <w:rPr>
+          <w:sz w:val="26"/>
+          <w:szCs w:val="26"/>
+        </w:rPr>
+      </w:pPr>
+      <w:r>
+        <w:rPr>
+          <w:b w:val="1"/>
+          <w:bCs w:val="1"/>
+          <w:sz w:val="24"/>
+          <w:szCs w:val="24"/>
+          <w:rtl w:val="0"/>
+        </w:rPr>
         <w:t xml:space="preserve">Usuário:</w:t>
       </w:r>
       <w:r>
@@ -9980,6 +10292,40 @@
           <w:rtl w:val="0"/>
         </w:rPr>
         <w:t xml:space="preserve"> Pessoa que possui uma conta de acesso à plataforma e utiliza suas funcionalidades conforme seu perfil, permissões e, quando aplicável, vínculos existentes.</w:t>
+      </w:r>
+      <w:r>
+        <w:rPr>
+          <w:rtl w:val="0"/>
+        </w:rPr>
+      </w:r>
+    </w:p>
+    <w:p>
+      <w:pPr>
+        <w:widowControl w:val="0"/>
+        <w:numPr>
+          <w:ilvl w:val="0"/>
+          <w:numId w:val="51"/>
+        </w:numPr>
+        <w:spacing w:after="0" w:before="0" w:line="360" w:lineRule="auto"/>
+        <w:ind w:left="720" w:hanging="360"/>
+        <w:rPr>
+          <w:sz w:val="26"/>
+          <w:szCs w:val="26"/>
+        </w:rPr>
+      </w:pPr>
+      <w:r>
+        <w:rPr>
+          <w:b w:val="1"/>
+          <w:bCs w:val="1"/>
+          <w:rtl w:val="0"/>
+        </w:rPr>
+        <w:t xml:space="preserve">Versão da Evolução:</w:t>
+      </w:r>
+      <w:r>
+        <w:rPr>
+          <w:rtl w:val="0"/>
+        </w:rPr>
+        <w:t xml:space="preserve"> Conteúdo de uma Evolução em determinado momento. Cada revisão gera uma nova versão, e as versões anteriores são preservadas.</w:t>
       </w:r>
       <w:r>
         <w:rPr>
@@ -11196,13 +11542,10 @@
         </w:rPr>
       </w:pPr>
       <w:r>
-        <w:rPr>
-          <w:sz w:val="24"/>
-          <w:szCs w:val="24"/>
-        </w:rPr>
+        <w:rPr/>
         <w:drawing>
           <wp:inline distB="114300" distT="114300" distL="114300" distR="114300">
-            <wp:extent cx="5731200" cy="5219700"/>
+            <wp:extent cx="5760000" cy="4648200"/>
             <wp:effectExtent b="0" l="0" r="0" t="0"/>
             <wp:docPr id="1" name="image1.png"/>
             <a:graphic>
@@ -11222,7 +11565,7 @@
                   <pic:spPr>
                     <a:xfrm>
                       <a:off x="0" y="0"/>
-                      <a:ext cx="5731200" cy="5219700"/>
+                      <a:ext cx="5760000" cy="4648200"/>
                     </a:xfrm>
                     <a:prstGeom prst="rect"/>
                     <a:ln/>
@@ -20884,6 +21227,25 @@
     </w:p>
     <w:p>
       <w:pPr>
+        <w:numPr>
+          <w:ilvl w:val="0"/>
+          <w:numId w:val="23"/>
+        </w:numPr>
+        <w:spacing w:after="0" w:before="0" w:line="360" w:lineRule="auto"/>
+        <w:ind w:left="720" w:hanging="360"/>
+        <w:rPr>
+          <w:u w:val="none"/>
+        </w:rPr>
+      </w:pPr>
+      <w:r>
+        <w:rPr>
+          <w:rtl w:val="0"/>
+        </w:rPr>
+        <w:t xml:space="preserve">O atendimento pode ser registrado sem agendamento prévio. Nesse caso, o Psicólogo informa o Paciente, a data e o horário em que ele aconteceu.</w:t>
+      </w:r>
+    </w:p>
+    <w:p>
+      <w:pPr>
         <w:spacing w:after="0" w:before="0" w:line="360" w:lineRule="auto"/>
         <w:rPr>
           <w:sz w:val="24"/>
@@ -32625,6 +32987,76 @@
     </w:p>
     <w:p>
       <w:pPr>
+        <w:spacing w:after="0" w:lineRule="auto"/>
+        <w:rPr/>
+      </w:pPr>
+      <w:r>
+        <w:rPr>
+          <w:rtl w:val="0"/>
+        </w:rPr>
+      </w:r>
+    </w:p>
+    <w:p>
+      <w:pPr>
+        <w:spacing w:after="0" w:lineRule="auto"/>
+        <w:ind w:left="0" w:firstLine="0"/>
+        <w:rPr/>
+      </w:pPr>
+      <w:r>
+        <w:rPr>
+          <w:b w:val="1"/>
+          <w:bCs w:val="1"/>
+          <w:rtl w:val="0"/>
+        </w:rPr>
+        <w:t xml:space="preserve">RN-080 – Atendimento sem agendamento prévio.</w:t>
+      </w:r>
+      <w:r>
+        <w:rPr>
+          <w:rtl w:val="0"/>
+        </w:rPr>
+        <w:t xml:space="preserve"> </w:t>
+      </w:r>
+    </w:p>
+    <w:p>
+      <w:pPr>
+        <w:spacing w:after="0" w:lineRule="auto"/>
+        <w:ind w:left="0" w:firstLine="0"/>
+        <w:rPr/>
+      </w:pPr>
+      <w:r>
+        <w:rPr>
+          <w:rtl w:val="0"/>
+        </w:rPr>
+      </w:r>
+    </w:p>
+    <w:p>
+      <w:pPr>
+        <w:keepNext w:val="0"/>
+        <w:keepLines w:val="0"/>
+        <w:pageBreakBefore w:val="0"/>
+        <w:widowControl w:val="1"/>
+        <w:pBdr>
+          <w:top w:space="0" w:sz="0" w:val="nil"/>
+          <w:left w:space="0" w:sz="0" w:val="nil"/>
+          <w:bottom w:space="0" w:sz="0" w:val="nil"/>
+          <w:right w:space="0" w:sz="0" w:val="nil"/>
+          <w:between w:space="0" w:sz="0" w:val="nil"/>
+        </w:pBdr>
+        <w:shd w:fill="auto" w:val="clear"/>
+        <w:spacing w:after="0" w:before="0" w:line="360" w:lineRule="auto"/>
+        <w:ind w:left="0" w:right="0" w:firstLine="708.6614173228347"/>
+        <w:jc w:val="both"/>
+        <w:rPr/>
+      </w:pPr>
+      <w:r>
+        <w:rPr>
+          <w:rtl w:val="0"/>
+        </w:rPr>
+        <w:t xml:space="preserve">Só o Psicólogo pode registrar um atendimento sem agendamento, para um Paciente já cadastrado e com data e horário no passado ou no presente. O horário não pode se sobrepor a outro agendamento ativo ou atendimento do mesmo Psicólogo. A disponibilidade cadastrada não é exigida. O registro cria a relação de atendimento (RN-025) e fica na auditoria. Não existe “não comparecimento” sem agendamento.</w:t>
+      </w:r>
+    </w:p>
+    <w:p>
+      <w:pPr>
         <w:pStyle w:val="Heading2"/>
         <w:rPr/>
       </w:pPr>
@@ -33278,7 +33710,7 @@
         <w:rPr>
           <w:rtl w:val="0"/>
         </w:rPr>
-        <w:t xml:space="preserve">Cada cobrança deverá estar associada a uma consulta avulsa ou a uma recorrência de atendimento.</w:t>
+        <w:t xml:space="preserve">Cada cobrança deverá estar associada a uma consulta avulsa (agendada ou registrada sem agendamento prévio) ou a uma recorrência de atendimento.</w:t>
       </w:r>
     </w:p>
     <w:p>
@@ -33390,7 +33822,7 @@
         <w:rPr>
           <w:rtl w:val="0"/>
         </w:rPr>
-        <w:t xml:space="preserve">A confirmação do pagamento deverá ser independente da confirmação de presença do Paciente na consulta.</w:t>
+        <w:t xml:space="preserve">A confirmação do pagamento deverá ser independente da confirmação de presença do Paciente na consulta. A cobrança de um atendimento sem agendamento prévio é gerada no registro do atendimento.</w:t>
       </w:r>
     </w:p>
     <w:p>

</xml_diff>

<commit_message>
Padroniza o Serviço Externo de Pagamentos e atualiza os três documentos
- Diagrama de casos de uso 08 com o Serviço Externo de Pagamentos
- Visão: nome do serviço de pagamentos padronizado
- Casos de uso: explicação das relações «include» e «extend» e do ator Agendador
- Modelagem de domínio: conceitos ligados aos casos de uso UC-050 a UC-054
</commit_message>
<xml_diff>
--- a/docs/01-visao-requisitos-e-regras.docx
+++ b/docs/01-visao-requisitos-e-regras.docx
@@ -8310,7 +8310,7 @@
                 <w:szCs w:val="20"/>
                 <w:rtl w:val="0"/>
               </w:rPr>
-              <w:t xml:space="preserve">Serviço externo de pagamento</w:t>
+              <w:t xml:space="preserve">Serviço Externo de Pagamentos</w:t>
             </w:r>
           </w:p>
         </w:tc>
@@ -8482,7 +8482,7 @@
                 <w:szCs w:val="20"/>
                 <w:rtl w:val="0"/>
               </w:rPr>
-              <w:t xml:space="preserve">Ator abstrato que generaliza Administrador e Atendente nas operações administrativas sobre pacientes (UC-015 e UC-018).</w:t>
+              <w:t xml:space="preserve">Ator abstrato que generaliza Administrador e Atendente nas operações administrativas sobre pacientes (UC-015, UC-018 e UC-019).</w:t>
             </w:r>
           </w:p>
         </w:tc>
@@ -26928,7 +26928,7 @@
         <w:rPr>
           <w:rtl w:val="0"/>
         </w:rPr>
-        <w:t xml:space="preserve">Permite pagar cobranças de consultas avulsas e mensalidades por meio de um serviço externo de pagamento.</w:t>
+        <w:t xml:space="preserve">Permite pagar cobranças de consultas avulsas e mensalidades por meio de um Serviço Externo de Pagamentos.</w:t>
       </w:r>
     </w:p>
     <w:p>
@@ -27030,7 +27030,7 @@
         <w:rPr>
           <w:rtl w:val="0"/>
         </w:rPr>
-        <w:t xml:space="preserve">A operação é encaminhada ao serviço externo de pagamento.</w:t>
+        <w:t xml:space="preserve">A operação é encaminhada ao Serviço Externo de Pagamentos.</w:t>
       </w:r>
     </w:p>
     <w:p>
@@ -27346,7 +27346,7 @@
         <w:rPr>
           <w:rtl w:val="0"/>
         </w:rPr>
-        <w:t xml:space="preserve"> Serviço externo de pagamento.</w:t>
+        <w:t xml:space="preserve"> Serviço Externo de Pagamentos.</w:t>
       </w:r>
     </w:p>
     <w:p>
@@ -29596,7 +29596,7 @@
         <w:rPr>
           <w:rtl w:val="0"/>
         </w:rPr>
-        <w:t xml:space="preserve"> Serviço de notificações.</w:t>
+        <w:t xml:space="preserve"> Serviço Externo de Notificação.</w:t>
       </w:r>
     </w:p>
     <w:p>
@@ -29826,7 +29826,7 @@
         <w:rPr>
           <w:rtl w:val="0"/>
         </w:rPr>
-        <w:t xml:space="preserve"> Serviço de notificações.</w:t>
+        <w:t xml:space="preserve"> Serviço Externo de Notificação.</w:t>
       </w:r>
     </w:p>
     <w:p>
@@ -29966,7 +29966,7 @@
         <w:rPr>
           <w:rtl w:val="0"/>
         </w:rPr>
-        <w:t xml:space="preserve">RF-074 - Integrar com serviço externo de pagamento</w:t>
+        <w:t xml:space="preserve">RF-074 - Integrar com Serviço Externo de Pagamentos</w:t>
       </w:r>
     </w:p>
     <w:p>
@@ -29994,7 +29994,7 @@
         <w:rPr>
           <w:rtl w:val="0"/>
         </w:rPr>
-        <w:t xml:space="preserve">O sistema se integra a um gateway de pagamento para enviar as solicitações de pagamento e receber os resultados.</w:t>
+        <w:t xml:space="preserve">O sistema se integra ao Serviço Externo de Pagamentos para enviar as solicitações de pagamento e receber os resultados.</w:t>
       </w:r>
     </w:p>
     <w:p>
@@ -30014,7 +30014,7 @@
         <w:rPr>
           <w:rtl w:val="0"/>
         </w:rPr>
-        <w:t xml:space="preserve"> Gateway de pagamento.</w:t>
+        <w:t xml:space="preserve"> Serviço Externo de Pagamentos.</w:t>
       </w:r>
     </w:p>
     <w:p>
@@ -30052,7 +30052,7 @@
         <w:rPr>
           <w:rtl w:val="0"/>
         </w:rPr>
-        <w:t xml:space="preserve">O sistema envia ao gateway os pedidos de pagamento por PIX ou cartão de crédito, sempre identificando a cobrança.</w:t>
+        <w:t xml:space="preserve">O sistema envia ao Serviço Externo de Pagamentos os pedidos de pagamento por PIX ou cartão de crédito, sempre identificando a cobrança.</w:t>
       </w:r>
     </w:p>
     <w:p>
@@ -30074,7 +30074,7 @@
         <w:rPr>
           <w:rtl w:val="0"/>
         </w:rPr>
-        <w:t xml:space="preserve">O resultado informado pelo gateway é recebido e associado à tentativa de pagamento correspondente.</w:t>
+        <w:t xml:space="preserve">O resultado informado pelo Serviço Externo de Pagamentos é recebido e associado à tentativa de pagamento correspondente.</w:t>
       </w:r>
     </w:p>
     <w:p>
@@ -30138,7 +30138,7 @@
         <w:rPr>
           <w:rtl w:val="0"/>
         </w:rPr>
-        <w:t xml:space="preserve"> o registro dos resultados financeiros já está no RF-062. Este requisito trata apenas da integração com o gateway, sem criar um segundo fluxo de pagamento.</w:t>
+        <w:t xml:space="preserve"> o registro dos resultados financeiros já está no RF-062. Este requisito trata apenas da integração com o Serviço Externo de Pagamentos, sem criar um segundo fluxo de pagamento.</w:t>
       </w:r>
     </w:p>
     <w:p>
@@ -30242,7 +30242,7 @@
         <w:rPr>
           <w:rtl w:val="0"/>
         </w:rPr>
-        <w:t xml:space="preserve"> Serviço de notificações.</w:t>
+        <w:t xml:space="preserve"> Serviço Externo de Notificação.</w:t>
       </w:r>
     </w:p>
     <w:p>
@@ -34182,7 +34182,7 @@
         <w:rPr>
           <w:rtl w:val="0"/>
         </w:rPr>
-        <w:t xml:space="preserve">Os pagamentos deverão ser realizados por PIX ou cartão de crédito, por meio de um serviço externo de pagamento.</w:t>
+        <w:t xml:space="preserve">Os pagamentos deverão ser realizados por PIX ou cartão de crédito, por meio de um Serviço Externo de Pagamentos.</w:t>
       </w:r>
     </w:p>
     <w:p>
@@ -34784,7 +34784,7 @@
         <w:rPr>
           <w:rtl w:val="0"/>
         </w:rPr>
-        <w:t xml:space="preserve">O processamento das transações financeiras será responsabilidade do gateway de pagamento, cabendo ao Nexo solicitar operações, receber resultados e atualizar seus registros internos.</w:t>
+        <w:t xml:space="preserve">O processamento das transações financeiras será responsabilidade do Serviço Externo de Pagamentos, cabendo ao Nexo solicitar operações, receber resultados e atualizar seus registros internos.</w:t>
       </w:r>
     </w:p>
     <w:p>
@@ -34812,7 +34812,7 @@
         <w:rPr>
           <w:rtl w:val="0"/>
         </w:rPr>
-        <w:t xml:space="preserve">Cada retorno recebido do gateway deverá ser associado à respectiva tentativa de pagamento e cobrança, preservando a rastreabilidade das operações.</w:t>
+        <w:t xml:space="preserve">Cada retorno recebido do Serviço Externo de Pagamentos deverá ser associado à respectiva tentativa de pagamento e cobrança, preservando a rastreabilidade das operações.</w:t>
       </w:r>
     </w:p>
     <w:p>

</xml_diff>